<commit_message>
docs: finalize v0.13.0 release records
</commit_message>
<xml_diff>
--- a/DeepSeek-Agent-V3-工作日志-0.13.0.docx
+++ b/DeepSeek-Agent-V3-工作日志-0.13.0.docx
@@ -27,7 +27,7 @@
           <w:rFonts w:ascii="Arial" w:hAnsi="Arial" w:eastAsia="Microsoft YaHei"/>
           <w:sz w:val="21"/>
         </w:rPr>
-        <w:t>状态：0.13.0 候选代码、完整离线门、隔离安装和唯一在线代表案例均已通过，正在</w:t>
+        <w:t>状态：0.13.0 实现提交已推送，完整离线门、隔离安装、唯一在线代表案例和 GitHub</w:t>
       </w:r>
     </w:p>
     <w:p>
@@ -36,7 +36,7 @@
           <w:rFonts w:ascii="Arial" w:hAnsi="Arial" w:eastAsia="Microsoft YaHei"/>
           <w:sz w:val="21"/>
         </w:rPr>
-        <w:t>完成提交、tag、GitHub Actions 和远端文件树核验。</w:t>
+        <w:t>Actions Python 3.11/3.12/3.13 均通过；正在生成最终文档提交、tag 和远端树核验。</w:t>
       </w:r>
     </w:p>
     <w:p/>
@@ -693,6 +693,8 @@
         <w:t>实际两份 Word：三处字节一致，CRC/OPC、正文、core.version、版本和日期元数据通过</w:t>
         <w:br/>
         <w:t>python -m agent --version：deep-agent 0.13.0</w:t>
+        <w:br/>
+        <w:t>GitHub Actions run 30439942343：Python 3.11/3.12/3.13 各 679 passed</w:t>
       </w:r>
     </w:p>
     <w:p/>
@@ -921,7 +923,7 @@
           <w:rFonts w:ascii="Arial" w:hAnsi="Arial" w:eastAsia="Microsoft YaHei"/>
           <w:sz w:val="21"/>
         </w:rPr>
-        <w:t>实现提交：待最终提交后记录</w:t>
+        <w:t>实现提交：`4a70ceb0ab62e0209e08541759d915f21d98010a`</w:t>
       </w:r>
     </w:p>
     <w:p>
@@ -945,7 +947,7 @@
           <w:rFonts w:ascii="Arial" w:hAnsi="Arial" w:eastAsia="Microsoft YaHei"/>
           <w:sz w:val="21"/>
         </w:rPr>
-        <w:t>GitHub 推送：待完成</w:t>
+        <w:t>GitHub main 首次推送：成功</w:t>
       </w:r>
     </w:p>
     <w:p>
@@ -957,7 +959,16 @@
           <w:rFonts w:ascii="Arial" w:hAnsi="Arial" w:eastAsia="Microsoft YaHei"/>
           <w:sz w:val="21"/>
         </w:rPr>
-        <w:t>GitHub Actions：待完成</w:t>
+        <w:t>GitHub Actions：run `30439942343` 成功；三个 Python 版本的 Ruff 0.15.21、</w:t>
+      </w:r>
+    </w:p>
+    <w:p>
+      <w:r>
+        <w:rPr>
+          <w:rFonts w:ascii="Arial" w:hAnsi="Arial" w:eastAsia="Microsoft YaHei"/>
+          <w:sz w:val="21"/>
+        </w:rPr>
+        <w:t xml:space="preserve">  format、679 项测试和 compileall 全部通过</w:t>
       </w:r>
     </w:p>
     <w:p>

</xml_diff>